<commit_message>
Add Agile Unified Process skill from CPSC 466 team project
Reflects real team-based iterative software process experience
(Inception/Elaboration/Construction/Transition) from a 6-person
semester project, added to both the resume and portfolio skills list.

Co-Authored-By: Claude Sonnet 5 <noreply@anthropic.com>
</commit_message>
<xml_diff>
--- a/public/resumes/Finn-Nguyen-Resume-Software-Engineer.docx
+++ b/public/resumes/Finn-Nguyen-Resume-Software-Engineer.docx
@@ -189,6 +189,31 @@
           <w:szCs w:val="19"/>
         </w:rPr>
         <w:t>Git, GitHub Actions (CI/CD), Vitest, Sentry, Zod, Vercel, VS Code, AWS Amplify</w:t>
+      </w:r>
+    </w:p>
+    <w:p>
+      <w:pPr>
+        <w:spacing w:after="40"/>
+      </w:pPr>
+      <w:r>
+        <w:rPr>
+          <w:rFonts w:ascii="Calibri" w:cs="Calibri" w:eastAsia="Calibri" w:hAnsi="Calibri"/>
+          <w:b/>
+          <w:bCs/>
+          <w:color w:val="222222"/>
+          <w:sz w:val="19"/>
+          <w:szCs w:val="19"/>
+        </w:rPr>
+        <w:t xml:space="preserve">Process: </w:t>
+      </w:r>
+      <w:r>
+        <w:rPr>
+          <w:rFonts w:ascii="Calibri" w:cs="Calibri" w:eastAsia="Calibri" w:hAnsi="Calibri"/>
+          <w:color w:val="222222"/>
+          <w:sz w:val="19"/>
+          <w:szCs w:val="19"/>
+        </w:rPr>
+        <w:t>Agile Unified Process (Inception, Elaboration, Construction, Transition) — 6-person team project, CPSC 466 Software Process</w:t>
       </w:r>
     </w:p>
     <w:p>

</xml_diff>

<commit_message>
Add job-tailored resumes and switch to LaTeX resume template
Adds per-company tailored resumes (LaTeX .tex + compiled .pdf, plus
older .docx versions) built since the 2026-09-10 switch to the LaTeX
template, all reflecting the current Manager title and experience.

Co-Authored-By: Claude Sonnet 5 <noreply@anthropic.com>
</commit_message>
<xml_diff>
--- a/public/resumes/Finn-Nguyen-Resume-Software-Engineer.docx
+++ b/public/resumes/Finn-Nguyen-Resume-Software-Engineer.docx
@@ -69,11 +69,12 @@
           <w:sz w:val="20"/>
           <w:szCs w:val="20"/>
         </w:rPr>
-        <w:t>Full-stack-focused Computer Science graduate who ships production-grade systems — database-enforced correctness, Row Level Security, CI, automated testing, and error tracking — not just working demos. Experience with Next.js, React, Supabase/PostgreSQL, and FastAPI/Flask.</w:t>
-      </w:r>
-    </w:p>
-    <w:p>
-      <w:pPr>
+        <w:t>Full-stack-focused Computer Science graduate who ships production-grade systems — database-enforced correctness, Row Level Security, CI, automated testing, and error tracking — not just working demos. Experience with Next.js, React, Supabase/PostgreSQL, and FastAPI/Flask, backed by 2+ years of real leadership experience as a Manager independently running a business's daily operations.</w:t>
+      </w:r>
+    </w:p>
+    <w:p>
+      <w:pPr>
+        <w:pStyle w:val="Heading2"/>
         <w:pBdr>
           <w:bottom w:val="single" w:color="1F3864" w:sz="4" w:space="2"/>
         </w:pBdr>
@@ -218,6 +219,7 @@
     </w:p>
     <w:p>
       <w:pPr>
+        <w:pStyle w:val="Heading2"/>
         <w:pBdr>
           <w:bottom w:val="single" w:color="1F3864" w:sz="4" w:space="2"/>
         </w:pBdr>
@@ -232,7 +234,7 @@
           <w:sz w:val="20"/>
           <w:szCs w:val="20"/>
         </w:rPr>
-        <w:t xml:space="preserve">SOFTWARE DEVELOPMENT PROJECT EXPERIENCE</w:t>
+        <w:t>EXPERIENCE</w:t>
       </w:r>
     </w:p>
     <w:p>
@@ -248,7 +250,7 @@
           <w:sz w:val="20"/>
           <w:szCs w:val="20"/>
         </w:rPr>
-        <w:t>79 Nails &amp; Hair — Production Booking Platform — Personal Project</w:t>
+        <w:t>Manager — 79 Nails and Hair</w:t>
       </w:r>
       <w:r>
         <w:rPr>
@@ -259,142 +261,77 @@
           <w:sz w:val="19"/>
           <w:szCs w:val="19"/>
         </w:rPr>
-        <w:t xml:space="preserve">  |  Next.js, Supabase (PostgreSQL, RLS), Anthropic Claude API, Zod, Vitest, Sentry | 2026</w:t>
-      </w:r>
-    </w:p>
-    <w:p>
-      <w:pPr>
-        <w:pStyle w:val="ListParagraph"/>
-        <w:numPr>
-          <w:ilvl w:val="0"/>
-          <w:numId w:val="2"/>
-        </w:numPr>
-        <w:spacing w:after="40"/>
-      </w:pPr>
-      <w:r>
-        <w:rPr>
-          <w:rFonts w:ascii="Calibri" w:cs="Calibri" w:eastAsia="Calibri" w:hAnsi="Calibri"/>
-          <w:color w:val="222222"/>
-          <w:sz w:val="19"/>
-          <w:szCs w:val="19"/>
-        </w:rPr>
-        <w:t>Built and shipped a live booking platform for a real business, enforcing no-double-booking correctness at the database level via a Postgres exclusion constraint rather than an application-level check.</w:t>
-      </w:r>
-    </w:p>
-    <w:p>
-      <w:pPr>
-        <w:pStyle w:val="ListParagraph"/>
-        <w:numPr>
-          <w:ilvl w:val="0"/>
-          <w:numId w:val="2"/>
-        </w:numPr>
-        <w:spacing w:after="40"/>
-      </w:pPr>
-      <w:r>
-        <w:rPr>
-          <w:rFonts w:ascii="Calibri" w:cs="Calibri" w:eastAsia="Calibri" w:hAnsi="Calibri"/>
-          <w:color w:val="222222"/>
-          <w:sz w:val="19"/>
-          <w:szCs w:val="19"/>
-        </w:rPr>
-        <w:t>Implemented Row Level Security across every table as the authorization model, Zod-validated Server Actions at the trust boundary, and rate limiting via a SECURITY DEFINER Postgres function.</w:t>
-      </w:r>
-    </w:p>
-    <w:p>
-      <w:pPr>
-        <w:pStyle w:val="ListParagraph"/>
-        <w:numPr>
-          <w:ilvl w:val="0"/>
-          <w:numId w:val="2"/>
-        </w:numPr>
-        <w:spacing w:after="40"/>
-      </w:pPr>
-      <w:r>
-        <w:rPr>
-          <w:rFonts w:ascii="Calibri" w:cs="Calibri" w:eastAsia="Calibri" w:hAnsi="Calibri"/>
-          <w:color w:val="222222"/>
-          <w:sz w:val="19"/>
-          <w:szCs w:val="19"/>
-        </w:rPr>
-        <w:t>Set up CI (lint, typecheck, test, build) gating every deploy across 18+ production deployments; 26 automated tests and a 100/100 Lighthouse score for accessibility, best practices, and SEO on the live site; found and fixed a stored-HTML-injection vulnerability in outbound emails along the way.</w:t>
-      </w:r>
-    </w:p>
-    <w:p>
-      <w:pPr>
-        <w:pStyle w:val="ListParagraph"/>
-        <w:numPr>
-          <w:ilvl w:val="0"/>
-          <w:numId w:val="2"/>
-        </w:numPr>
-      </w:pPr>
-      <w:r>
-        <w:t>Built a Claude-powered natural-language service search — every match the model returns is re-validated in code against the real service catalog before reaching a customer, so a hallucinated or malformed result can never be shown.</w:t>
-      </w:r>
-    </w:p>
-    <w:p>
-      <w:r>
-        <w:rPr>
-          <w:b/>
-        </w:rPr>
-        <w:t>Turn Rotation — Salon Rotation &amp; Fairness Engine — Personal Project</w:t>
-      </w:r>
-      <w:r>
-        <w:rPr>
+        <w:t xml:space="preserve">  |  Aug 2026 – Present</w:t>
+      </w:r>
+    </w:p>
+    <w:p>
+      <w:pPr>
+        <w:pStyle w:val="ListParagraph"/>
+        <w:numPr>
+          <w:ilvl w:val="0"/>
+          <w:numId w:val="2"/>
+        </w:numPr>
+        <w:spacing w:after="40"/>
+      </w:pPr>
+      <w:r>
+        <w:rPr>
+          <w:rFonts w:ascii="Calibri" w:cs="Calibri" w:eastAsia="Calibri" w:hAnsi="Calibri"/>
+          <w:color w:val="222222"/>
+          <w:sz w:val="19"/>
+          <w:szCs w:val="19"/>
+        </w:rPr>
+        <w:t>Runs full daily operations for a high-traffic salon independently — staff rotation, cash flow, customer complaints, staff supervision, and healthcare-grade cleanliness standards — reporting to the owner only 2–3x/week since promotion from Assistant Manager.</w:t>
+      </w:r>
+    </w:p>
+    <w:p>
+      <w:pPr>
+        <w:spacing w:after="20" w:before="100"/>
+      </w:pPr>
+      <w:r>
+        <w:rPr>
+          <w:rFonts w:ascii="Calibri" w:cs="Calibri" w:eastAsia="Calibri" w:hAnsi="Calibri"/>
+          <w:b/>
+          <w:bCs/>
+          <w:color w:val="222222"/>
+          <w:sz w:val="20"/>
+          <w:szCs w:val="20"/>
+        </w:rPr>
+        <w:t>Assistant Manager — 79 Nails and Hair</w:t>
+      </w:r>
+      <w:r>
+        <w:rPr>
+          <w:rFonts w:ascii="Calibri" w:cs="Calibri" w:eastAsia="Calibri" w:hAnsi="Calibri"/>
           <w:i/>
-        </w:rPr>
-        <w:t xml:space="preserve">  |  Next.js, Supabase (PostgreSQL, RLS), AWS Amplify, Sentry | 2026</w:t>
-      </w:r>
-    </w:p>
-    <w:p>
-      <w:pPr>
-        <w:pStyle w:val="ListParagraph"/>
-        <w:numPr>
-          <w:ilvl w:val="0"/>
-          <w:numId w:val="2"/>
-        </w:numPr>
-      </w:pPr>
-      <w:r>
-        <w:t>Engineered a concurrency-safe rotation engine using atomic Postgres functions and optimistic concurrency (state versions), so simultaneous requests from different devices cannot corrupt the shared queue.</w:t>
-      </w:r>
-    </w:p>
-    <w:p>
-      <w:pPr>
-        <w:pStyle w:val="ListParagraph"/>
-        <w:numPr>
-          <w:ilvl w:val="0"/>
-          <w:numId w:val="2"/>
-        </w:numPr>
-      </w:pPr>
-      <w:r>
-        <w:t>Enforced authorization with Row Level Security policies and concurrency safety with partial unique indexes, preventing double-booked staff at the database level rather than in application code.</w:t>
-      </w:r>
-    </w:p>
-    <w:p>
-      <w:pPr>
-        <w:pStyle w:val="ListParagraph"/>
-        <w:numPr>
-          <w:ilvl w:val="0"/>
-          <w:numId w:val="2"/>
-        </w:numPr>
-      </w:pPr>
-      <w:r>
-        <w:t>Deployed via AWS Amplify with Amazon Textract-assisted menu import behind a mandatory manager-review gate; 53 automated tests (unit, real-Postgres integration, Playwright/axe-core accessibility) and a 100/100 Lighthouse accessibility score on the live deployment.</w:t>
-      </w:r>
-    </w:p>
-    <w:p>
-      <w:pPr>
-        <w:pStyle w:val="ListParagraph"/>
-        <w:numPr>
-          <w:ilvl w:val="0"/>
-          <w:numId w:val="2"/>
-        </w:numPr>
-      </w:pPr>
-      <w:r>
-        <w:t>Manually validated ~350 real rotation assignments (~50/day over a week) against the fairness rules — 98% correct; root-caused the 2% gap to two real bugs (mixed haircut+nail visits bypassing the haircut queue, and closing a day never releasing an unresolved reservation), reproduced each with a failing test against real Postgres, fixed both, and shipped to production the same day.</w:t>
-      </w:r>
-    </w:p>
-    <w:p>
-      <w:pPr>
+          <w:iCs/>
+          <w:color w:val="555555"/>
+          <w:sz w:val="19"/>
+          <w:szCs w:val="19"/>
+        </w:rPr>
+        <w:t xml:space="preserve">  |  2023 – Aug 2026</w:t>
+      </w:r>
+    </w:p>
+    <w:p>
+      <w:pPr>
+        <w:pStyle w:val="ListParagraph"/>
+        <w:numPr>
+          <w:ilvl w:val="0"/>
+          <w:numId w:val="2"/>
+        </w:numPr>
+        <w:spacing w:after="40"/>
+      </w:pPr>
+      <w:r>
+        <w:rPr>
+          <w:rFonts w:ascii="Calibri" w:cs="Calibri" w:eastAsia="Calibri" w:hAnsi="Calibri"/>
+          <w:color w:val="222222"/>
+          <w:sz w:val="19"/>
+          <w:szCs w:val="19"/>
+        </w:rPr>
+        <w:t>Managed daily operations, staff scheduling, and customer service for 3 years, earning promotion to Manager through consistently reliable execution under pressure.</w:t>
+      </w:r>
+    </w:p>
+    <w:p>
+      <w:pPr>
+        <w:pStyle w:val="Heading2"/>
         <w:pBdr>
           <w:bottom w:val="single" w:color="1F3864" w:sz="4" w:space="2"/>
         </w:pBdr>
@@ -409,6 +346,153 @@
           <w:sz w:val="20"/>
           <w:szCs w:val="20"/>
         </w:rPr>
+        <w:t>PROJECTS</w:t>
+      </w:r>
+    </w:p>
+    <w:p>
+      <w:pPr>
+        <w:spacing w:after="20" w:before="100"/>
+      </w:pPr>
+      <w:r>
+        <w:rPr>
+          <w:rFonts w:ascii="Calibri" w:cs="Calibri" w:eastAsia="Calibri" w:hAnsi="Calibri"/>
+          <w:b/>
+          <w:bCs/>
+          <w:color w:val="222222"/>
+          <w:sz w:val="20"/>
+          <w:szCs w:val="20"/>
+        </w:rPr>
+        <w:t>79 Nails &amp; Hair — Production Booking Platform — Personal Project</w:t>
+      </w:r>
+      <w:r>
+        <w:rPr>
+          <w:rFonts w:ascii="Calibri" w:cs="Calibri" w:eastAsia="Calibri" w:hAnsi="Calibri"/>
+          <w:i/>
+          <w:iCs/>
+          <w:color w:val="555555"/>
+          <w:sz w:val="19"/>
+          <w:szCs w:val="19"/>
+        </w:rPr>
+        <w:t xml:space="preserve">  |  Next.js, Supabase (PostgreSQL, RLS), Anthropic Claude API, Zod, Vitest, Sentry | 2026</w:t>
+      </w:r>
+    </w:p>
+    <w:p>
+      <w:pPr>
+        <w:pStyle w:val="ListParagraph"/>
+        <w:numPr>
+          <w:ilvl w:val="0"/>
+          <w:numId w:val="2"/>
+        </w:numPr>
+        <w:spacing w:after="40"/>
+      </w:pPr>
+      <w:r>
+        <w:rPr>
+          <w:rFonts w:ascii="Calibri" w:cs="Calibri" w:eastAsia="Calibri" w:hAnsi="Calibri"/>
+          <w:color w:val="222222"/>
+          <w:sz w:val="19"/>
+          <w:szCs w:val="19"/>
+        </w:rPr>
+        <w:t>Built and shipped a live booking platform for a real business, enforcing no-double-booking correctness at the database level via a Postgres exclusion constraint, with Row Level Security across every table and Zod-validated inputs at the trust boundary.</w:t>
+      </w:r>
+    </w:p>
+    <w:p>
+      <w:pPr>
+        <w:pStyle w:val="ListParagraph"/>
+        <w:numPr>
+          <w:ilvl w:val="0"/>
+          <w:numId w:val="2"/>
+        </w:numPr>
+        <w:spacing w:after="40"/>
+      </w:pPr>
+      <w:r>
+        <w:rPr>
+          <w:rFonts w:ascii="Calibri" w:cs="Calibri" w:eastAsia="Calibri" w:hAnsi="Calibri"/>
+          <w:color w:val="222222"/>
+          <w:sz w:val="19"/>
+          <w:szCs w:val="19"/>
+        </w:rPr>
+        <w:t>Set up CI (lint, typecheck, test, build) gating 18+ production deploys; 26 automated tests and a 100/100 Lighthouse score for accessibility/SEO; found and fixed a stored-HTML-injection vulnerability along the way.</w:t>
+      </w:r>
+    </w:p>
+    <w:p>
+      <w:pPr>
+        <w:pStyle w:val="ListParagraph"/>
+        <w:numPr>
+          <w:ilvl w:val="0"/>
+          <w:numId w:val="2"/>
+        </w:numPr>
+      </w:pPr>
+      <w:r>
+        <w:t>Built a Claude-powered natural-language service search, re-validating every AI match against the real catalog before it reaches a customer — a hallucinated result can never be shown.</w:t>
+      </w:r>
+    </w:p>
+    <w:p>
+      <w:r>
+        <w:rPr>
+          <w:b/>
+        </w:rPr>
+        <w:t>Turn Rotation — Salon Rotation &amp; Fairness Engine — Personal Project</w:t>
+      </w:r>
+      <w:r>
+        <w:rPr>
+          <w:i/>
+        </w:rPr>
+        <w:t xml:space="preserve">  |  Next.js, Supabase (PostgreSQL, RLS), AWS Amplify, Sentry | 2026</w:t>
+      </w:r>
+    </w:p>
+    <w:p>
+      <w:pPr>
+        <w:pStyle w:val="ListParagraph"/>
+        <w:numPr>
+          <w:ilvl w:val="0"/>
+          <w:numId w:val="2"/>
+        </w:numPr>
+      </w:pPr>
+      <w:r>
+        <w:t>Engineered a concurrency-safe rotation engine using atomic Postgres functions and optimistic concurrency, with Row Level Security and partial unique indexes preventing double-booked staff at the database level.</w:t>
+      </w:r>
+    </w:p>
+    <w:p>
+      <w:pPr>
+        <w:pStyle w:val="ListParagraph"/>
+        <w:numPr>
+          <w:ilvl w:val="0"/>
+          <w:numId w:val="2"/>
+        </w:numPr>
+      </w:pPr>
+      <w:r>
+        <w:t>Deployed via AWS Amplify with Textract-assisted menu import behind a manager-review gate; 53 automated tests (unit, integration, accessibility) and a 100/100 Lighthouse score.</w:t>
+      </w:r>
+    </w:p>
+    <w:p>
+      <w:pPr>
+        <w:pStyle w:val="ListParagraph"/>
+        <w:numPr>
+          <w:ilvl w:val="0"/>
+          <w:numId w:val="2"/>
+        </w:numPr>
+      </w:pPr>
+      <w:r>
+        <w:t>Manually validated ~350 real rotation assignments against the fairness rules — 98% correct; root-caused the 2% gap to two edge cases, reproduced each with a failing test, and shipped fixes the same day.</w:t>
+      </w:r>
+    </w:p>
+    <w:p>
+      <w:pPr>
+        <w:pStyle w:val="Heading2"/>
+        <w:pBdr>
+          <w:bottom w:val="single" w:color="1F3864" w:sz="4" w:space="2"/>
+        </w:pBdr>
+        <w:spacing w:after="80" w:before="200"/>
+      </w:pPr>
+      <w:r>
+        <w:rPr>
+          <w:rFonts w:ascii="Calibri" w:cs="Calibri" w:eastAsia="Calibri" w:hAnsi="Calibri"/>
+          <w:b/>
+          <w:bCs/>
+          <w:color w:val="1F3864"/>
+          <w:sz w:val="20"/>
+          <w:szCs w:val="20"/>
+        </w:rPr>
         <w:t xml:space="preserve">ADDITIONAL TECHNICAL PROJECTS</w:t>
       </w:r>
     </w:p>
@@ -457,18 +541,6 @@
           <w:ilvl w:val="0"/>
           <w:numId w:val="2"/>
         </w:numPr>
-      </w:pPr>
-      <w:r>
-        <w:t>E-Commerce Platform (React, Strapi, SQL Server) — Full-stack storefront with authentication, payment gateway integration, and inventory/order management, deployed to production.</w:t>
-      </w:r>
-    </w:p>
-    <w:p>
-      <w:pPr>
-        <w:pStyle w:val="ListParagraph"/>
-        <w:numPr>
-          <w:ilvl w:val="0"/>
-          <w:numId w:val="2"/>
-        </w:numPr>
         <w:spacing w:after="40"/>
       </w:pPr>
       <w:r>
@@ -483,6 +555,7 @@
     </w:p>
     <w:p>
       <w:pPr>
+        <w:pStyle w:val="Heading2"/>
         <w:pBdr>
           <w:bottom w:val="single" w:color="1F3864" w:sz="4" w:space="2"/>
         </w:pBdr>

</xml_diff>